<commit_message>
fix: remove fictional interviews, em-dashes, fix citations, add rubric self-score
- Replace all Sofía/Diego fictional content with pending notices
- Remove em-dashes from all blockquote <cite> tags
- Fix citation #8 (attribute Joan Schine via Díaz Barriga) with ellipsis
- Fix citation #9 (add truncation ellipsis)
- Add 35-pt rubric self-assessment table to cambios-equipo.html (33/35)
- Regenerate DOCX
</commit_message>
<xml_diff>
--- a/documento/primaria-secundaria-final.docx
+++ b/documento/primaria-secundaria-final.docx
@@ -529,7 +529,7 @@
         <w:pStyle w:val="Citation"/>
       </w:pPr>
       <w:r>
-        <w:t>— Díaz Barriga (2006, p. 110)</w:t>
+        <w:t>Díaz Barriga (2006, p. 110)</w:t>
       </w:r>
     </w:p>
     <w:p>
@@ -1282,7 +1282,7 @@
         <w:pStyle w:val="Citation"/>
       </w:pPr>
       <w:r>
-        <w:t>— Díaz Barriga (2006, p. 145)</w:t>
+        <w:t>Díaz Barriga (2006, p. 145)</w:t>
       </w:r>
     </w:p>
     <w:p>
@@ -1311,7 +1311,7 @@
         <w:pStyle w:val="Citation"/>
       </w:pPr>
       <w:r>
-        <w:t>— Pimienta (2012, p. 135)</w:t>
+        <w:t>Pimienta (2012, p. 135)</w:t>
       </w:r>
     </w:p>
     <w:p>
@@ -1759,392 +1759,6 @@
       </w:pPr>
       <w:r>
         <w:t>Respuestas</w:t>
-      </w:r>
-    </w:p>
-    <w:p>
-      <w:r>
-        <w:rPr>
-          <w:b/>
-        </w:rPr>
-        <w:t>Estudiante:</w:t>
-      </w:r>
-      <w:r>
-        <w:t>Sofía, 5.° de primaria</w:t>
-      </w:r>
-    </w:p>
-    <w:p>
-      <w:r>
-        <w:rPr>
-          <w:b/>
-        </w:rPr>
-        <w:t>Modalidad:</w:t>
-      </w:r>
-      <w:r>
-        <w:t>Verbal y dibujo</w:t>
-      </w:r>
-    </w:p>
-    <w:p>
-      <w:r>
-        <w:rPr>
-          <w:b/>
-        </w:rPr>
-        <w:t>Entrevistador:</w:t>
-      </w:r>
-      <w:r>
-        <w:t>Sofía, ¿qué es lo que más te gusta de tu salón? ¿Qué cambiarías?</w:t>
-      </w:r>
-    </w:p>
-    <w:p>
-      <w:r>
-        <w:rPr>
-          <w:b/>
-        </w:rPr>
-        <w:t>Sofía:</w:t>
-      </w:r>
-      <w:r>
-        <w:t>Me gusta que mi maestra pone cosas bonitas en la pared, como los trabajos que hacemos. Pero lo que no me gusta es que las bancas están pegadas al piso, bueno no pegadas pero son bien pesadas, y siempre estamos viendo al pizarrón. A veces me aburro de estar así todo el día. Yo cambiaría las sillas, pondría unas más chiquitas que se pudieran mover fácil.</w:t>
-      </w:r>
-    </w:p>
-    <w:p>
-      <w:r>
-        <w:rPr>
-          <w:b/>
-        </w:rPr>
-        <w:t>Entrevistador:</w:t>
-      </w:r>
-      <w:r>
-        <w:t>¿Trabajas con otros compañeros en clase? ¿Cómo lo hacen?</w:t>
-      </w:r>
-    </w:p>
-    <w:p>
-      <w:r>
-        <w:rPr>
-          <w:b/>
-        </w:rPr>
-        <w:t>Sofía:</w:t>
-      </w:r>
-      <w:r>
-        <w:t>¡Sí! Eso es lo que más me gusta. Cuando la maestra nos deja hacer equipos, nos juntamos y platicamos de las ideas. Yo siempre quiero estar con mi amiga Valentina porque ella dibuja bien bonito y yo escribo. Nos repartimos las cosas. Lo malo es que a veces nada más nos dejan trabajar en equipo como una vez a la semana, y yo quisiera que fuera más seguido.</w:t>
-      </w:r>
-    </w:p>
-    <w:p>
-      <w:r>
-        <w:rPr>
-          <w:b/>
-        </w:rPr>
-        <w:t>Entrevistador:</w:t>
-      </w:r>
-      <w:r>
-        <w:t>Si pudieras mover los muebles de tu salón, ¿cómo los pondrías? ¿Por qué?</w:t>
-      </w:r>
-    </w:p>
-    <w:p>
-      <w:r>
-        <w:rPr>
-          <w:b/>
-        </w:rPr>
-        <w:t>Sofía:</w:t>
-      </w:r>
-      <w:r>
-        <w:t>Ay, yo pondría las mesas juntas, como en grupitos, para que pudiéramos vernos las caras. Porque cuando estamos en filas yo nada más veo la espalda de Mateo y pues no puedo platicar con nadie. Y también pondría un rincón con cojines para leer, porque a mí me encanta leer pero en la banca me canso.</w:t>
-      </w:r>
-    </w:p>
-    <w:p>
-      <w:r>
-        <w:rPr>
-          <w:b/>
-        </w:rPr>
-        <w:t>Entrevistador:</w:t>
-      </w:r>
-      <w:r>
-        <w:t>¿Hay momentos en que el salón te hace sentir incómoda o nerviosa? ¿Cuándo?</w:t>
-      </w:r>
-    </w:p>
-    <w:p>
-      <w:r>
-        <w:rPr>
-          <w:b/>
-        </w:rPr>
-        <w:t>Sofía:</w:t>
-      </w:r>
-      <w:r>
-        <w:t>Mmm... sí, cuando estamos mucho rato sentados viendo al pizarrón me empiezo a mover en la silla y la maestra me dice que me esté quieta, pero es que ya no aguanto. También cuando hace calor el salón se pone horrible porque las ventanas son chiquitas. Y a veces cuando la maestra pregunta algo y todos están callados, me da pena levantar la mano, no sé por qué.</w:t>
-      </w:r>
-    </w:p>
-    <w:p>
-      <w:r>
-        <w:rPr>
-          <w:b/>
-        </w:rPr>
-        <w:t>Entrevistador:</w:t>
-      </w:r>
-      <w:r>
-        <w:t>¿Usas computadoras o tabletas en clase? ¿Para qué te gustaría usarlas?</w:t>
-      </w:r>
-    </w:p>
-    <w:p>
-      <w:r>
-        <w:rPr>
-          <w:b/>
-        </w:rPr>
-        <w:t>Sofía:</w:t>
-      </w:r>
-      <w:r>
-        <w:t>En la escuela no, no hay. Pero en mi casa uso el celular de mi mamá para buscar cosas de la tarea. Una vez busqué sobre los volcanes y encontré un video bien padre. Me gustaría que en la escuela hubiera tabletas para buscar información, y también para hacer presentaciones. Mi prima que va en secundaria hace presentaciones con fotos y todo, y yo quiero hacer eso también.</w:t>
-      </w:r>
-    </w:p>
-    <w:p>
-      <w:r>
-        <w:rPr>
-          <w:b/>
-        </w:rPr>
-        <w:t>Entrevistador:</w:t>
-      </w:r>
-      <w:r>
-        <w:t>Dibuja cómo sería tu salón perfecto. Explícame tu dibujo.</w:t>
-      </w:r>
-    </w:p>
-    <w:p>
-      <w:r>
-        <w:rPr>
-          <w:b/>
-        </w:rPr>
-        <w:t>Sofía:</w:t>
-      </w:r>
-      <w:r>
-        <w:rPr>
-          <w:i/>
-        </w:rPr>
-        <w:t>[Sofía dibuja un salón con mesas redondas agrupadas, un rincón con cojines de colores y una zona con caballetes de pintura. En una esquina dibuja una planta grande.]</w:t>
-      </w:r>
-      <w:r>
-        <w:t>Mira, aquí puse las mesas en círculos para que todos nos veamos. Acá es donde lees, tiene cojines y libros. Y esta parte es para crear cosas, como dibujar o pintar, porque a mí me gusta mucho el arte. Esa es la Zona de Crear. Y puse una planta porque mi mamá dice que las plantas hacen que te sientas más tranquilo.</w:t>
-      </w:r>
-    </w:p>
-    <w:p>
-      <w:r>
-        <w:rPr>
-          <w:b/>
-        </w:rPr>
-        <w:t>Entrevistador:</w:t>
-      </w:r>
-      <w:r>
-        <w:t>¿Cómo te ayuda tu maestra cuando no entiendes algo? ¿Cómo te gustaría que te ayudara?</w:t>
-      </w:r>
-    </w:p>
-    <w:p>
-      <w:r>
-        <w:rPr>
-          <w:b/>
-        </w:rPr>
-        <w:t>Sofía:</w:t>
-      </w:r>
-      <w:r>
-        <w:t>Mi maestra es buena, cuando no entiendo se acerca y me explica otra vez. Pero a veces hay muchos niños que tampoco entienden y no le alcanza el tiempo para todos. A mí me gustaría que nos dejara intentar primero entre nosotros, porque a veces Valentina me explica las mates mejor que nadie, y luego si de plano no le entendemos, ya que venga la maestra.</w:t>
-      </w:r>
-    </w:p>
-    <w:p>
-      <w:r>
-        <w:rPr>
-          <w:b/>
-        </w:rPr>
-        <w:t>Conexión con el diseño:</w:t>
-      </w:r>
-      <w:r>
-        <w:t>Sofía pide exactamente lo que las zonas ofrecen: mesas agrupadas (Intercambiar), rincón de lectura (Desarrollar), crear con las manos (Crear), plantas (diseño biofílico). Su deseo de "intentar primero entre nosotros" valida el aprendizaje cooperativo como estrategia central (Díaz Barriga, 2006).</w:t>
-      </w:r>
-    </w:p>
-    <w:p>
-      <w:r>
-        <w:rPr>
-          <w:b/>
-        </w:rPr>
-        <w:t>Estudiante:</w:t>
-      </w:r>
-      <w:r>
-        <w:t>Diego, 2.° de secundaria</w:t>
-      </w:r>
-    </w:p>
-    <w:p>
-      <w:r>
-        <w:rPr>
-          <w:b/>
-        </w:rPr>
-        <w:t>Modalidad:</w:t>
-      </w:r>
-      <w:r>
-        <w:t>Verbal</w:t>
-      </w:r>
-    </w:p>
-    <w:p>
-      <w:r>
-        <w:rPr>
-          <w:b/>
-        </w:rPr>
-        <w:t>Entrevistador:</w:t>
-      </w:r>
-      <w:r>
-        <w:t>Diego, ¿qué es lo que más te gusta de tu salón? ¿Qué cambiarías?</w:t>
-      </w:r>
-    </w:p>
-    <w:p>
-      <w:r>
-        <w:rPr>
-          <w:b/>
-        </w:rPr>
-        <w:t>Diego:</w:t>
-      </w:r>
-      <w:r>
-        <w:t>Pues... la verdad no hay mucho que me guste del salón. Está bien básico: pizarrón, bancas, y ya. Lo único bueno es que me siento hasta atrás con mis amigos. Lo que cambiaría es todo, la verdad. Está bien aburrido pasar seis horas sentado en el mismo lugar viendo al maestro hablar. Yo pondría un espacio donde pudiéramos trabajar de pie o movernos, algo diferente.</w:t>
-      </w:r>
-    </w:p>
-    <w:p>
-      <w:r>
-        <w:rPr>
-          <w:b/>
-        </w:rPr>
-        <w:t>Entrevistador:</w:t>
-      </w:r>
-      <w:r>
-        <w:t>¿Trabajas con otros compañeros en clase? ¿Cómo lo hacen?</w:t>
-      </w:r>
-    </w:p>
-    <w:p>
-      <w:r>
-        <w:rPr>
-          <w:b/>
-        </w:rPr>
-        <w:t>Diego:</w:t>
-      </w:r>
-      <w:r>
-        <w:t>A veces, pero casi siempre es de que "júntense en equipos de cuatro" y ya, sin que el maestro explique bien qué vamos a hacer. Luego siempre los mismos hacemos todo y los demás nada más copian. Lo que sí me gusta es cuando nos dejan hacer proyectos, como una vez que hicimos una maqueta del sistema solar. Ahí sí todos trabajamos porque estaba divertido, no era nada más copiar del libro.</w:t>
-      </w:r>
-    </w:p>
-    <w:p>
-      <w:r>
-        <w:rPr>
-          <w:b/>
-        </w:rPr>
-        <w:t>Entrevistador:</w:t>
-      </w:r>
-      <w:r>
-        <w:t>Si pudieras mover los muebles de tu salón, ¿cómo los pondrías? ¿Por qué?</w:t>
-      </w:r>
-    </w:p>
-    <w:p>
-      <w:r>
-        <w:rPr>
-          <w:b/>
-        </w:rPr>
-        <w:t>Diego:</w:t>
-      </w:r>
-      <w:r>
-        <w:t>Yo quitaría las filas. Las filas son para que el maestro te vigile, no para que aprendas. Pondría mesas grandes donde cupieran como seis personas, y que se pudieran mover fácil para cuando necesitas trabajar solo. Y tendría un espacio enfrente como un escenario chiquito para cuando alguien presenta algo, porque las exposiciones las hacemos apretados junto al pizarrón y ni se ve.</w:t>
-      </w:r>
-    </w:p>
-    <w:p>
-      <w:r>
-        <w:rPr>
-          <w:b/>
-        </w:rPr>
-        <w:t>Entrevistador:</w:t>
-      </w:r>
-      <w:r>
-        <w:t>¿Hay momentos en que el salón te hace sentir incómodo o nervioso? ¿Cuándo?</w:t>
-      </w:r>
-    </w:p>
-    <w:p>
-      <w:r>
-        <w:rPr>
-          <w:b/>
-        </w:rPr>
-        <w:t>Diego:</w:t>
-      </w:r>
-      <w:r>
-        <w:t>Cuando el maestro lleva como cuarenta minutos hablando y hablando, y ya nadie le está poniendo atención pero él sigue. Me dan ganas de pararme, de hacer algo con las manos. También me incomoda que no puedo hablar con nadie porque luego te regañan, pero es que a veces quiero preguntarle algo a mi compañero sobre lo que estamos viendo, no es que esté echando relajo.</w:t>
-      </w:r>
-    </w:p>
-    <w:p>
-      <w:r>
-        <w:rPr>
-          <w:b/>
-        </w:rPr>
-        <w:t>Entrevistador:</w:t>
-      </w:r>
-      <w:r>
-        <w:t>¿Usas computadoras o tabletas en clase? ¿Para qué te gustaría usarlas?</w:t>
-      </w:r>
-    </w:p>
-    <w:p>
-      <w:r>
-        <w:rPr>
-          <w:b/>
-        </w:rPr>
-        <w:t>Diego:</w:t>
-      </w:r>
-      <w:r>
-        <w:t>En la escuela hay un salón de cómputo pero casi no vamos, y las computadoras están bien viejas. En mi casa sí uso internet para todo, para las tareas, para ver tutoriales de YouTube cuando no le entiendo a algo. Me gustaría que hubiera tabletas en el salón con internet para buscar cosas cuando estamos en clase, no tener que esperar a llegar a mi casa. Y un proyector que sí funcione, porque el que tenemos falla cada dos días.</w:t>
-      </w:r>
-    </w:p>
-    <w:p>
-      <w:r>
-        <w:rPr>
-          <w:b/>
-        </w:rPr>
-        <w:t>Entrevistador:</w:t>
-      </w:r>
-      <w:r>
-        <w:t>Dibuja cómo sería tu salón perfecto. Explícame tu dibujo.</w:t>
-      </w:r>
-    </w:p>
-    <w:p>
-      <w:r>
-        <w:rPr>
-          <w:b/>
-        </w:rPr>
-        <w:t>Diego:</w:t>
-      </w:r>
-      <w:r>
-        <w:rPr>
-          <w:i/>
-        </w:rPr>
-        <w:t>[Diego dibuja un salón amplio dividido en secciones. Una zona tiene mesas hexagonales, otra tiene un proyector grande con gradas para sentarse, y al fondo hay computadoras.]</w:t>
-      </w:r>
-      <w:r>
-        <w:t>Esto de aquí son las mesas para trabajar en equipo, son como hexágonos para que quepamos varios. Acá es donde presentas, tiene un proyector grande y unas gradas porque así todos ven bien. Y al fondo están las computadoras para investigar. La idea es que no estés clavado en un solo lugar todo el día, que te puedas mover según lo que estés haciendo.</w:t>
-      </w:r>
-    </w:p>
-    <w:p>
-      <w:r>
-        <w:rPr>
-          <w:b/>
-        </w:rPr>
-        <w:t>Entrevistador:</w:t>
-      </w:r>
-      <w:r>
-        <w:t>¿Cómo te ayuda tu maestra cuando no entiendes algo? ¿Cómo te gustaría que te ayudara?</w:t>
-      </w:r>
-    </w:p>
-    <w:p>
-      <w:r>
-        <w:rPr>
-          <w:b/>
-        </w:rPr>
-        <w:t>Diego:</w:t>
-      </w:r>
-      <w:r>
-        <w:t>Depende del maestro. Algunos sí se acercan y te lo explican diferente, pero otros nada más repiten lo mismo más fuerte, como si el problema fuera que no escuché. A mí me ayudaría más si nos dejaran trabajar en el problema primero, como intentarlo nosotros, y luego el maestro pasa a ver cómo vas y te da pistas. No que te diga la respuesta, sino que te haga pensar. Los videos de YouTube me ayudan porque puedo pausar y repetir, y en la clase no puedes hacer eso.</w:t>
-      </w:r>
-    </w:p>
-    <w:p>
-      <w:r>
-        <w:rPr>
-          <w:b/>
-        </w:rPr>
-        <w:t>Conexión con el diseño:</w:t>
-      </w:r>
-      <w:r>
-        <w:t>Diego rechaza las filas y pide mesas hexagonales (mobiliario modular), un escenario para presentaciones (Zona Presentar) y computadoras para investigar (Zona Investigar). Su reclamo de que "el maestro repite lo mismo más fuerte" es exactamente lo que el backward design busca superar: el docente que piensa como diseñador de actividades, no como evaluador.</w:t>
       </w:r>
     </w:p>
     <w:p>
@@ -2658,7 +2272,7 @@
         <w:pStyle w:val="Citation"/>
       </w:pPr>
       <w:r>
-        <w:t>— Wiggins y McTighe (2017a, p. 14)</w:t>
+        <w:t>Wiggins y McTighe (2017a, p. 14)</w:t>
       </w:r>
     </w:p>
     <w:p>
@@ -2710,7 +2324,7 @@
         <w:pStyle w:val="Citation"/>
       </w:pPr>
       <w:r>
-        <w:t>— Díaz Barriga (2006, p. 53)</w:t>
+        <w:t>Díaz Barriga (2006, p. 53)</w:t>
       </w:r>
     </w:p>
     <w:tbl>
@@ -3226,7 +2840,7 @@
         <w:t>Mobiliario modular y reconfigurable:</w:t>
       </w:r>
       <w:r>
-        <w:t>Mesas y sillas ligeras que permiten pasar del trabajo individual al grupal en minutos. Superficies escribibles, cojines, gradas y rincones de lectura. Sofía lo pidió: "mesas donde pudiéramos sentarnos juntos." Diego lo pidió: "mesas grandes que se pudieran mover fácil."</w:t>
+        <w:t>Mesas y sillas ligeras que permiten pasar del trabajo individual al grupal en minutos. Superficies escribibles, cojines, gradas y rincones de lectura.</w:t>
       </w:r>
     </w:p>
     <w:p>
@@ -3240,7 +2854,7 @@
         <w:t>Diseño biofílico:</w:t>
       </w:r>
       <w:r>
-        <w:t>Luz natural, plantas de interior, materiales naturales como madera y corcho. La investigación en psicología ambiental asocia estos elementos con menor estrés y mejor concentración. Sofía dibujó una planta en su salón ideal.</w:t>
+        <w:t>Luz natural, plantas de interior, materiales naturales como madera y corcho. La investigación en psicología ambiental asocia estos elementos con menor estrés y mejor concentración.</w:t>
       </w:r>
     </w:p>
     <w:p>
@@ -3304,7 +2918,7 @@
         <w:t>Dispositivos compartidos y equidad digital:</w:t>
       </w:r>
       <w:r>
-        <w:t>Estaciones de cómputo compartidas, tabletas rotativas y acceso equitativo. Diego pidió "tabletas con internet para buscar cosas en clase, no tener que esperar a llegar a mi casa."</w:t>
+        <w:t>Estaciones de cómputo compartidas, tabletas rotativas y acceso equitativo a internet dentro del aula.</w:t>
       </w:r>
     </w:p>
     <w:p>
@@ -3340,7 +2954,7 @@
         <w:t>Seguridad psicológica:</w:t>
       </w:r>
       <w:r>
-        <w:t>Un espacio donde cada estudiante se siente libre de expresar ideas, cometer errores y pedir ayuda sin temor al juicio. Sofía dijo que le da pena levantar la mano cuando todos están callados. Ese miedo desaparece cuando el espacio es seguro (Durlak et al., 2011).</w:t>
+        <w:t>Un espacio donde cada estudiante se siente libre de expresar ideas, cometer errores y pedir ayuda sin temor al juicio. Ese miedo desaparece cuando el espacio es seguro (Durlak et al., 2011).</w:t>
       </w:r>
     </w:p>
     <w:p>
@@ -3368,7 +2982,7 @@
         <w:t>Espacios de calma:</w:t>
       </w:r>
       <w:r>
-        <w:t>Rincones para la autorregulación emocional. El estudiante puede retirarse cuando necesita recuperar su equilibrio, sin que esto sea visto como castigo. Sofía pidió "un rincón para leer cuando estoy cansada."</w:t>
+        <w:t>Rincones para la autorregulación emocional. El estudiante puede retirarse cuando necesita recuperar su equilibrio, sin que esto sea visto como castigo.</w:t>
       </w:r>
     </w:p>
     <w:p>
@@ -3418,7 +3032,7 @@
         <w:pStyle w:val="Citation"/>
       </w:pPr>
       <w:r>
-        <w:t>— Díaz Barriga (2006, p. 155)</w:t>
+        <w:t>Díaz Barriga (2006, p. 155)</w:t>
       </w:r>
     </w:p>
     <w:tbl>
@@ -3952,7 +3566,7 @@
         <w:pStyle w:val="Citation"/>
       </w:pPr>
       <w:r>
-        <w:t>— Díaz Barriga (2006, p. 159)</w:t>
+        <w:t>Díaz Barriga (2006, p. 159)</w:t>
       </w:r>
     </w:p>
     <w:p>
@@ -4403,10 +4017,10 @@
         <w:rPr>
           <w:b/>
         </w:rPr>
-        <w:t>Conexión con las voces:</w:t>
-      </w:r>
-      <w:r>
-        <w:t>Sofía dijo que quiere "hacer experimentos, no solo copiar del pizarrón." Este proyecto la pone a investigar, crear y presentar. Diego dijo que le gustan los proyectos "porque todos trabajan." Este proyecto asigna roles diferenciados por fortalezas.</w:t>
+        <w:t>Conexión pedagógica:</w:t>
+      </w:r>
+      <w:r>
+        <w:t>Este proyecto pone al estudiante a investigar, crear y presentar en lugar de copiar del pizarrón. Asigna roles diferenciados por fortalezas dentro de equipos colaborativos.</w:t>
       </w:r>
     </w:p>
     <w:p>
@@ -4414,7 +4028,7 @@
         <w:pStyle w:val="Blockquote"/>
       </w:pPr>
       <w:r>
-        <w:t>"Involucrar a los jóvenes en proyectos comunitarios no consiste en una simple metodología; es un componente crítico para el desarrollo de la comunidad misma."</w:t>
+        <w:t>"Involucrar a los jóvenes en proyectos comunitarios no consiste en una simple metodología [...]; es un componente crítico para el desarrollo de la comunidad misma."</w:t>
       </w:r>
     </w:p>
     <w:p>
@@ -4422,7 +4036,7 @@
         <w:pStyle w:val="Citation"/>
       </w:pPr>
       <w:r>
-        <w:t>— Díaz Barriga (2006, p. 117)</w:t>
+        <w:t>Díaz Barriga (2006, p. 117, citando a Schine)</w:t>
       </w:r>
     </w:p>
     <w:p>
@@ -4713,71 +4327,23 @@
         <w:pStyle w:val="Heading2"/>
       </w:pPr>
       <w:r>
-        <w:t>Ejemplo: Entrada de Sofía, Semana 3 del proyecto "El Agua de Mi Colonia"</w:t>
+        <w:t>Ejemplo: Entrada de Diario, Semana 3 del proyecto "El Agua de Mi Colonia"</w:t>
       </w:r>
     </w:p>
     <w:p>
-      <w:r>
-        <w:rPr>
-          <w:b/>
-        </w:rPr>
-        <w:t>¿Qué estrategia me funcionó?</w:t>
+      <w:pPr>
+        <w:pStyle w:val="Blockquote"/>
+      </w:pPr>
+      <w:r>
+        <w:t>"La autoevaluación puede tomar la forma de una retroalimentación autogenerada que conduzca al alumno a valorar su propio trabajo de manera lúcida, honesta [...]."</w:t>
       </w:r>
     </w:p>
     <w:p>
-      <w:r>
-        <w:rPr>
-          <w:i/>
-        </w:rPr>
-        <w:t>Cuando investigamos lo del agua, yo al principio quería buscar todo en internet. Pero Valentina me dijo que fuéramos a preguntarle a doña Carmen que vive enfrente de la escuela. Y sí, ella nos contó cosas que no venían en ningún lado. Aprendí que a veces la mejor información no está en Google.</w:t>
-      </w:r>
-    </w:p>
-    <w:p>
-      <w:r>
-        <w:rPr>
-          <w:b/>
-        </w:rPr>
-        <w:t>¿Cuál no?</w:t>
-      </w:r>
-    </w:p>
-    <w:p>
-      <w:r>
-        <w:rPr>
-          <w:i/>
-        </w:rPr>
-        <w:t>Intenté hacer el filtro yo sola sin leer las instrucciones y me salió mal. Luego lo hicimos en equipo leyendo paso por paso y ahí sí funcionó.</w:t>
-      </w:r>
-    </w:p>
-    <w:p>
-      <w:r>
-        <w:rPr>
-          <w:b/>
-        </w:rPr>
-        <w:t>¿Cómo me ayudaron mis compañeros?</w:t>
-      </w:r>
-    </w:p>
-    <w:p>
-      <w:r>
-        <w:rPr>
-          <w:i/>
-        </w:rPr>
-        <w:t>Mateo calculó cuánto costaría el filtro. Yo hice el cartel porque me gusta dibujar. Cada quien hizo lo que se le da mejor.</w:t>
-      </w:r>
-    </w:p>
-    <w:p>
-      <w:pPr>
-        <w:pStyle w:val="Blockquote"/>
-      </w:pPr>
-      <w:r>
-        <w:t>"La autoevaluación puede tomar la forma de una retroalimentación autogenerada que conduzca al alumno a valorar su propio trabajo de manera lúcida y honesta."</w:t>
-      </w:r>
-    </w:p>
-    <w:p>
       <w:pPr>
         <w:pStyle w:val="Citation"/>
       </w:pPr>
       <w:r>
-        <w:t>— Díaz Barriga (2006, p. 177)</w:t>
+        <w:t>Díaz Barriga (2006, p. 177)</w:t>
       </w:r>
     </w:p>
     <w:p>
@@ -5739,7 +5305,7 @@
               <w:rPr>
                 <w:sz w:val="19"/>
               </w:rPr>
-              <w:t>Proyecto comunitario. Perfiles situados en Puebla. Voces de Sofía y Diego.</w:t>
+              <w:t>Proyecto comunitario. Perfiles situados en Puebla. Entrevistas pendientes.</w:t>
             </w:r>
           </w:p>
         </w:tc>
@@ -5807,7 +5373,7 @@
     </w:p>
     <w:p>
       <w:r>
-        <w:t>El aula del futuro que proponemos no depende de presupuestos millonarios. Depende de cambiar la lógica: planear desde los resultados deseados, no desde los temas; evaluar con rúbricas que distingan niveles de comprensión, no con exámenes de opción múltiple; y diseñar espacios donde el estudiante se mueva entre zonas según lo que está haciendo. Las 6 facetas de Wiggins y McTighe (2017a) nos dieron el mapa. La enseñanza situada de Díaz Barriga (2006) nos dio el ancla. Las voces de Sofía y Diego nos recordaron para quién diseñamos.</w:t>
+        <w:t>El aula del futuro que proponemos no depende de presupuestos millonarios. Depende de cambiar la lógica: planear desde los resultados deseados, no desde los temas; evaluar con rúbricas que distingan niveles de comprensión, no con exámenes de opción múltiple; y diseñar espacios donde el estudiante se mueva entre zonas según lo que está haciendo. Las 6 facetas de Wiggins y McTighe (2017a) nos dieron el mapa. La enseñanza situada de Díaz Barriga (2006) nos dio el ancla. Las entrevistas a estudiantes (pendientes de levantamiento) nos recordarán para quién diseñamos.</w:t>
       </w:r>
     </w:p>
     <w:p>
@@ -5860,7 +5426,7 @@
     </w:p>
     <w:p>
       <w:r>
-        <w:t>Las transcripciones completas de las entrevistas se encuentran en la sección</w:t>
+        <w:t>Las transcripciones de las entrevistas se integrarán en la sección</w:t>
       </w:r>
       <w:r>
         <w:rPr>
@@ -5870,7 +5436,7 @@
         <w:t>Entrevistas a Estudiantes</w:t>
       </w:r>
       <w:r>
-        <w:t>. Se entrevistaron dos estudiantes utilizando la guía basada en el MCI (Fraser, 1998): Sofía (5.° de primaria, 10 años, modalidad verbal y dibujo) y Diego (2.° de secundaria, 13 años, modalidad verbal).</w:t>
+        <w:t>una vez que el equipo aplique la guía basada en el MCI (Fraser, 1998) a al menos dos estudiantes (uno de primaria, uno de secundaria).</w:t>
       </w:r>
     </w:p>
     <w:p>

</xml_diff>